<commit_message>
Audit fixes: anchor decoding claim on the ironclad 13 (same operating point) with 40 as a further set; fix calibration self-contradiction in closing; reconcile 17 vs 13; word count 1118
</commit_message>
<xml_diff>
--- a/incoming/edited/NeuroVFM_Matters_Arising_manuscript.docx
+++ b/incoming/edited/NeuroVFM_Matters_Arising_manuscript.docx
@@ -140,7 +140,7 @@
         <w:spacing w:line="480" w:lineRule="auto" w:after="0"/>
       </w:pPr>
       <w:r>
-        <w:t>The 55 studies missed by the report pipeline make this concrete. In 5, the report named a critical finding but GPT-5 did not escalate it. In the other 50, the report named none of the study’s critical findings, and most read as explicitly normal, for example, “Study is unremarkable.” These were complete reports rather than truncated or empty outputs, they were reproduced verbatim on regeneration, and the language model had received the same images as the classifier, including the bone window. In 40 of the 50, the classifier scored the missed finding above 0.5 (median 0.92), and 13 of the 50 would have been flagged by the classifier at the matched alarm rate (Fig. 1c). The omitted findings included calvarial fracture, intraparenchymal hemorrhage, subdural hematoma and mass effect (Extended Data Fig. 1). The original evaluation would count all 50 as failures of perception. For many of them, the encoder had represented the finding, and it was lost when the report was written. A report that reads as normal is more harmful than a missing flag, because it reassures and moves the scan down the worklist.</w:t>
+        <w:t>The 55 studies missed by the report pipeline make this concrete. In 5, the report named a critical finding but GPT-5 did not escalate it. In the other 50, the report named none of the study’s critical findings, and most read as explicitly normal, for example, “Study is unremarkable.” These were complete reports rather than truncated or empty outputs, they were reproduced verbatim on regeneration, and the language model had received the same images as the classifier, including the bone window. In 13 of the 50, the classifier would itself have flagged the study at the same operating point used for the report pipeline. These 13, together with 4 of the 5 reasoning misses, make up the 17 studies the classifier alone caught, so for these the encoder carried the finding while the report stayed silent. In a further 27, 40 of the 50 in all, the classifier scored the missed finding above 0.5, ranking it well above its scores on studies without the finding (median 0.92), though below the matched threshold (Fig. 1c). The omitted findings included calvarial fracture, intraparenchymal hemorrhage, subdural hematoma and mass effect (Extended Data Fig. 1). The original evaluation would count all 50 as failures of perception. For the 13, and likely many of the 40, the finding was present in the encoder and lost when the report was written. A report that reads as normal is more harmful than a missing flag, because it reassures and moves the scan down the worklist.</w:t>
       </w:r>
     </w:p>
     <w:p>
@@ -164,7 +164,7 @@
         <w:spacing w:line="480" w:lineRule="auto" w:after="0"/>
       </w:pPr>
       <w:r>
-        <w:t>None of this questions the strength of NeuroVFM. If anything, its encoder perceives more than the report-based evaluation gave it credit for. The authors envision reasoning models acting on structured, calibrated outputs from NeuroVFM¹, and the diagnostic classifier already produces exactly such outputs. We suggest that triage, and any evaluation of perception, be measured through those outputs as well as through generated text. The most direct test is in the authors’ hands: classifier scores for the 21 prospective urgent misses would show how many were failures of perception and how many were failures of report writing. More broadly, when a chain of models is judged only by the text it produces, errors of writing can be mistaken for errors of seeing⁸, and developers may then build larger models when what they need is a different readout.</w:t>
+        <w:t>None of this questions the strength of NeuroVFM. If anything, its encoder perceives more than the report-based evaluation gave it credit for. The authors envision reasoning models acting on structured, calibrated outputs from NeuroVFM¹, and the diagnostic classifier already produces structured scores of this kind, which once calibrated would be exactly those outputs. We suggest that triage, and any evaluation of perception, be measured through those outputs as well as through generated text. The most direct test is in the authors’ hands: classifier scores for the 21 prospective urgent misses would show how many were failures of perception and how many were failures of report writing. More broadly, when a chain of models is judged only by the text it produces, errors of writing can be mistaken for errors of seeing⁸, and developers may then build larger models when what they need is a different readout.</w:t>
       </w:r>
     </w:p>
     <w:p>

</xml_diff>